<commit_message>
Aplica el membrete institucional del HUV a la documentacion
Se regeneran los 8 documentos Word incorporando como fondo de pagina el
membrete oficial del Hospital Universitario del Valle (plantilla
PLANTILLA_MEMBRETE_2026): logos institucionales, codigo de formato
FOR-GDI-GDO-006 y marca de agua, presentes en todas las paginas.

Se ajustan los margenes de pagina (superior 1.93", laterales ~1.18"/0.79")
para que el contenido quede dentro del area util de la plantilla, y la
portada se rediseña para integrarse con el membrete.

Co-Authored-By: Claude Opus 4.7 (1M context) <noreply@anthropic.com>
</commit_message>
<xml_diff>
--- a/documentacion EVARISBOT/01_CREDENCIALES_Y_CONFIGURACION.docx
+++ b/documentacion EVARISBOT/01_CREDENCIALES_Y_CONFIGURACION.docx
@@ -4,72 +4,23 @@
   <w:body>
     <w:p>
       <w:pPr>
-        <w:pBdr>
-          <w:bottom w:val="single" w:color="2E3F84" w:sz="40" w:space="0"/>
-        </w:pBdr>
-        <w:shd w:fill="2E3F84" w:val="clear"/>
-        <w:spacing w:after="0" w:before="0"/>
-      </w:pPr>
-      <w:r>
-        <w:rPr>
-          <w:color w:val="1F2433"/>
-          <w:sz w:val="2"/>
-          <w:szCs w:val="2"/>
-        </w:rPr>
-        <w:t xml:space="preserve"> </w:t>
-      </w:r>
+        <w:spacing w:after="1500"/>
+      </w:pPr>
     </w:p>
     <w:p>
       <w:pPr>
-        <w:spacing w:after="900"/>
-      </w:pPr>
-    </w:p>
-    <w:p>
-      <w:pPr>
-        <w:spacing w:after="40"/>
+        <w:spacing w:after="60"/>
         <w:jc w:val="center"/>
       </w:pPr>
       <w:r>
         <w:rPr>
           <w:b/>
           <w:bCs/>
-          <w:color w:val="16235E"/>
-          <w:sz w:val="30"/>
-          <w:szCs w:val="30"/>
+          <w:color w:val="5A6478"/>
+          <w:sz w:val="20"/>
+          <w:szCs w:val="20"/>
         </w:rPr>
-        <w:t xml:space="preserve">HOSPITAL UNIVERSITARIO DEL VALLE</w:t>
-      </w:r>
-    </w:p>
-    <w:p>
-      <w:pPr>
-        <w:spacing w:after="30"/>
-        <w:jc w:val="center"/>
-      </w:pPr>
-      <w:r>
-        <w:rPr>
-          <w:b/>
-          <w:bCs/>
-          <w:color w:val="16235E"/>
-          <w:sz w:val="24"/>
-          <w:szCs w:val="24"/>
-        </w:rPr>
-        <w:t xml:space="preserve">«EVARISTO GARCÍA» E.S.E.</w:t>
-      </w:r>
-    </w:p>
-    <w:p>
-      <w:pPr>
-        <w:spacing w:after="700"/>
-        <w:jc w:val="center"/>
-      </w:pPr>
-      <w:r>
-        <w:rPr>
-          <w:i/>
-          <w:iCs/>
-          <w:color w:val="5A6478"/>
-          <w:sz w:val="21"/>
-          <w:szCs w:val="21"/>
-        </w:rPr>
-        <w:t xml:space="preserve">Oficina de Innovación y Desarrollo</w:t>
+        <w:t xml:space="preserve">DOCUMENTACIÓN DEL SISTEMA</w:t>
       </w:r>
     </w:p>
     <w:p>
@@ -82,15 +33,15 @@
           <w:b/>
           <w:bCs/>
           <w:color w:val="2E3F84"/>
-          <w:sz w:val="64"/>
-          <w:szCs w:val="64"/>
+          <w:sz w:val="66"/>
+          <w:szCs w:val="66"/>
         </w:rPr>
         <w:t xml:space="preserve">E V A R I S B O T</w:t>
       </w:r>
     </w:p>
     <w:p>
       <w:pPr>
-        <w:spacing w:after="520"/>
+        <w:spacing w:after="560" w:before="60"/>
         <w:jc w:val="center"/>
       </w:pPr>
       <w:r>
@@ -99,14 +50,14 @@
           <w:sz w:val="20"/>
           <w:szCs w:val="20"/>
         </w:rPr>
-        <w:t xml:space="preserve">Plataforma de mensajería WhatsApp para gestión de pacientes</w:t>
+        <w:t xml:space="preserve">Plataforma de mensajería WhatsApp para la gestión de pacientes</w:t>
       </w:r>
     </w:p>
     <w:p>
       <w:pPr>
         <w:pBdr>
-          <w:top w:val="single" w:color="2E3F84" w:sz="12"/>
-          <w:bottom w:val="single" w:color="2E3F84" w:sz="12"/>
+          <w:top w:val="single" w:color="2E3F84" w:sz="14"/>
+          <w:bottom w:val="single" w:color="2E3F84" w:sz="14"/>
         </w:pBdr>
         <w:spacing w:after="0"/>
         <w:jc w:val="center"/>
@@ -116,29 +67,29 @@
           <w:b/>
           <w:bCs/>
           <w:color w:val="16235E"/>
-          <w:sz w:val="38"/>
-          <w:szCs w:val="38"/>
+          <w:sz w:val="40"/>
+          <w:szCs w:val="40"/>
         </w:rPr>
         <w:t xml:space="preserve">  CREDENCIALES Y CONFIGURACIÓN  </w:t>
       </w:r>
     </w:p>
     <w:p>
       <w:pPr>
-        <w:spacing w:after="760" w:before="160"/>
+        <w:spacing w:after="620" w:before="170"/>
         <w:jc w:val="center"/>
       </w:pPr>
       <w:r>
         <w:rPr>
           <w:color w:val="5A6478"/>
-          <w:sz w:val="22"/>
-          <w:szCs w:val="22"/>
+          <w:sz w:val="21"/>
+          <w:szCs w:val="21"/>
         </w:rPr>
         <w:t xml:space="preserve">Guía de parámetros, variables de entorno y configuración operativa del sistema</w:t>
       </w:r>
     </w:p>
     <w:tbl>
       <w:tblPr>
-        <w:tblW w:type="dxa" w:w="6600"/>
+        <w:tblW w:type="dxa" w:w="6800"/>
         <w:jc w:val="center"/>
         <w:tblBorders>
           <w:top w:val="single" w:color="auto" w:sz="4"/>
@@ -150,13 +101,13 @@
         </w:tblBorders>
       </w:tblPr>
       <w:tblGrid>
-        <w:gridCol w:w="2600"/>
-        <w:gridCol w:w="4000"/>
+        <w:gridCol w:w="2700"/>
+        <w:gridCol w:w="4100"/>
       </w:tblGrid>
       <w:tr>
         <w:tc>
           <w:tcPr>
-            <w:tcW w:type="dxa" w:w="2600"/>
+            <w:tcW w:type="dxa" w:w="2700"/>
             <w:tcBorders>
               <w:top w:val="single" w:color="C9D0E3" w:sz="2"/>
               <w:left w:val="single" w:color="C9D0E3" w:sz="2"/>
@@ -166,9 +117,9 @@
             <w:shd w:fill="EEF1F8" w:val="clear"/>
             <w:tcMar>
               <w:top w:type="dxa" w:w="70"/>
-              <w:left w:type="dxa" w:w="120"/>
+              <w:left w:type="dxa" w:w="130"/>
               <w:bottom w:type="dxa" w:w="70"/>
-              <w:right w:type="dxa" w:w="120"/>
+              <w:right w:type="dxa" w:w="130"/>
             </w:tcMar>
           </w:tcPr>
           <w:p>
@@ -186,7 +137,7 @@
         </w:tc>
         <w:tc>
           <w:tcPr>
-            <w:tcW w:type="dxa" w:w="4000"/>
+            <w:tcW w:type="dxa" w:w="4100"/>
             <w:tcBorders>
               <w:top w:val="single" w:color="C9D0E3" w:sz="2"/>
               <w:left w:val="single" w:color="C9D0E3" w:sz="2"/>
@@ -196,9 +147,9 @@
             <w:shd w:fill="FFFFFF" w:val="clear"/>
             <w:tcMar>
               <w:top w:type="dxa" w:w="70"/>
-              <w:left w:type="dxa" w:w="120"/>
+              <w:left w:type="dxa" w:w="130"/>
               <w:bottom w:type="dxa" w:w="70"/>
-              <w:right w:type="dxa" w:w="120"/>
+              <w:right w:type="dxa" w:w="130"/>
             </w:tcMar>
           </w:tcPr>
           <w:p>
@@ -216,7 +167,7 @@
       <w:tr>
         <w:tc>
           <w:tcPr>
-            <w:tcW w:type="dxa" w:w="2600"/>
+            <w:tcW w:type="dxa" w:w="2700"/>
             <w:tcBorders>
               <w:top w:val="single" w:color="C9D0E3" w:sz="2"/>
               <w:left w:val="single" w:color="C9D0E3" w:sz="2"/>
@@ -226,9 +177,9 @@
             <w:shd w:fill="EEF1F8" w:val="clear"/>
             <w:tcMar>
               <w:top w:type="dxa" w:w="70"/>
-              <w:left w:type="dxa" w:w="120"/>
+              <w:left w:type="dxa" w:w="130"/>
               <w:bottom w:type="dxa" w:w="70"/>
-              <w:right w:type="dxa" w:w="120"/>
+              <w:right w:type="dxa" w:w="130"/>
             </w:tcMar>
           </w:tcPr>
           <w:p>
@@ -246,7 +197,7 @@
         </w:tc>
         <w:tc>
           <w:tcPr>
-            <w:tcW w:type="dxa" w:w="4000"/>
+            <w:tcW w:type="dxa" w:w="4100"/>
             <w:tcBorders>
               <w:top w:val="single" w:color="C9D0E3" w:sz="2"/>
               <w:left w:val="single" w:color="C9D0E3" w:sz="2"/>
@@ -256,9 +207,9 @@
             <w:shd w:fill="FFFFFF" w:val="clear"/>
             <w:tcMar>
               <w:top w:type="dxa" w:w="70"/>
-              <w:left w:type="dxa" w:w="120"/>
+              <w:left w:type="dxa" w:w="130"/>
               <w:bottom w:type="dxa" w:w="70"/>
-              <w:right w:type="dxa" w:w="120"/>
+              <w:right w:type="dxa" w:w="130"/>
             </w:tcMar>
           </w:tcPr>
           <w:p>
@@ -276,7 +227,7 @@
       <w:tr>
         <w:tc>
           <w:tcPr>
-            <w:tcW w:type="dxa" w:w="2600"/>
+            <w:tcW w:type="dxa" w:w="2700"/>
             <w:tcBorders>
               <w:top w:val="single" w:color="C9D0E3" w:sz="2"/>
               <w:left w:val="single" w:color="C9D0E3" w:sz="2"/>
@@ -286,9 +237,9 @@
             <w:shd w:fill="EEF1F8" w:val="clear"/>
             <w:tcMar>
               <w:top w:type="dxa" w:w="70"/>
-              <w:left w:type="dxa" w:w="120"/>
+              <w:left w:type="dxa" w:w="130"/>
               <w:bottom w:type="dxa" w:w="70"/>
-              <w:right w:type="dxa" w:w="120"/>
+              <w:right w:type="dxa" w:w="130"/>
             </w:tcMar>
           </w:tcPr>
           <w:p>
@@ -306,7 +257,7 @@
         </w:tc>
         <w:tc>
           <w:tcPr>
-            <w:tcW w:type="dxa" w:w="4000"/>
+            <w:tcW w:type="dxa" w:w="4100"/>
             <w:tcBorders>
               <w:top w:val="single" w:color="C9D0E3" w:sz="2"/>
               <w:left w:val="single" w:color="C9D0E3" w:sz="2"/>
@@ -316,9 +267,9 @@
             <w:shd w:fill="FFFFFF" w:val="clear"/>
             <w:tcMar>
               <w:top w:type="dxa" w:w="70"/>
-              <w:left w:type="dxa" w:w="120"/>
+              <w:left w:type="dxa" w:w="130"/>
               <w:bottom w:type="dxa" w:w="70"/>
-              <w:right w:type="dxa" w:w="120"/>
+              <w:right w:type="dxa" w:w="130"/>
             </w:tcMar>
           </w:tcPr>
           <w:p>
@@ -336,7 +287,7 @@
       <w:tr>
         <w:tc>
           <w:tcPr>
-            <w:tcW w:type="dxa" w:w="2600"/>
+            <w:tcW w:type="dxa" w:w="2700"/>
             <w:tcBorders>
               <w:top w:val="single" w:color="C9D0E3" w:sz="2"/>
               <w:left w:val="single" w:color="C9D0E3" w:sz="2"/>
@@ -346,9 +297,9 @@
             <w:shd w:fill="EEF1F8" w:val="clear"/>
             <w:tcMar>
               <w:top w:type="dxa" w:w="70"/>
-              <w:left w:type="dxa" w:w="120"/>
+              <w:left w:type="dxa" w:w="130"/>
               <w:bottom w:type="dxa" w:w="70"/>
-              <w:right w:type="dxa" w:w="120"/>
+              <w:right w:type="dxa" w:w="130"/>
             </w:tcMar>
           </w:tcPr>
           <w:p>
@@ -366,7 +317,7 @@
         </w:tc>
         <w:tc>
           <w:tcPr>
-            <w:tcW w:type="dxa" w:w="4000"/>
+            <w:tcW w:type="dxa" w:w="4100"/>
             <w:tcBorders>
               <w:top w:val="single" w:color="C9D0E3" w:sz="2"/>
               <w:left w:val="single" w:color="C9D0E3" w:sz="2"/>
@@ -376,9 +327,9 @@
             <w:shd w:fill="FFFFFF" w:val="clear"/>
             <w:tcMar>
               <w:top w:type="dxa" w:w="70"/>
-              <w:left w:type="dxa" w:w="120"/>
+              <w:left w:type="dxa" w:w="130"/>
               <w:bottom w:type="dxa" w:w="70"/>
-              <w:right w:type="dxa" w:w="120"/>
+              <w:right w:type="dxa" w:w="130"/>
             </w:tcMar>
           </w:tcPr>
           <w:p>
@@ -396,7 +347,7 @@
       <w:tr>
         <w:tc>
           <w:tcPr>
-            <w:tcW w:type="dxa" w:w="2600"/>
+            <w:tcW w:type="dxa" w:w="2700"/>
             <w:tcBorders>
               <w:top w:val="single" w:color="C9D0E3" w:sz="2"/>
               <w:left w:val="single" w:color="C9D0E3" w:sz="2"/>
@@ -406,9 +357,9 @@
             <w:shd w:fill="EEF1F8" w:val="clear"/>
             <w:tcMar>
               <w:top w:type="dxa" w:w="70"/>
-              <w:left w:type="dxa" w:w="120"/>
+              <w:left w:type="dxa" w:w="130"/>
               <w:bottom w:type="dxa" w:w="70"/>
-              <w:right w:type="dxa" w:w="120"/>
+              <w:right w:type="dxa" w:w="130"/>
             </w:tcMar>
           </w:tcPr>
           <w:p>
@@ -426,7 +377,7 @@
         </w:tc>
         <w:tc>
           <w:tcPr>
-            <w:tcW w:type="dxa" w:w="4000"/>
+            <w:tcW w:type="dxa" w:w="4100"/>
             <w:tcBorders>
               <w:top w:val="single" w:color="C9D0E3" w:sz="2"/>
               <w:left w:val="single" w:color="C9D0E3" w:sz="2"/>
@@ -436,9 +387,9 @@
             <w:shd w:fill="FFFFFF" w:val="clear"/>
             <w:tcMar>
               <w:top w:type="dxa" w:w="70"/>
-              <w:left w:type="dxa" w:w="120"/>
+              <w:left w:type="dxa" w:w="130"/>
               <w:bottom w:type="dxa" w:w="70"/>
-              <w:right w:type="dxa" w:w="120"/>
+              <w:right w:type="dxa" w:w="130"/>
             </w:tcMar>
           </w:tcPr>
           <w:p>
@@ -456,7 +407,7 @@
       <w:tr>
         <w:tc>
           <w:tcPr>
-            <w:tcW w:type="dxa" w:w="2600"/>
+            <w:tcW w:type="dxa" w:w="2700"/>
             <w:tcBorders>
               <w:top w:val="single" w:color="C9D0E3" w:sz="2"/>
               <w:left w:val="single" w:color="C9D0E3" w:sz="2"/>
@@ -466,9 +417,9 @@
             <w:shd w:fill="EEF1F8" w:val="clear"/>
             <w:tcMar>
               <w:top w:type="dxa" w:w="70"/>
-              <w:left w:type="dxa" w:w="120"/>
+              <w:left w:type="dxa" w:w="130"/>
               <w:bottom w:type="dxa" w:w="70"/>
-              <w:right w:type="dxa" w:w="120"/>
+              <w:right w:type="dxa" w:w="130"/>
             </w:tcMar>
           </w:tcPr>
           <w:p>
@@ -486,7 +437,7 @@
         </w:tc>
         <w:tc>
           <w:tcPr>
-            <w:tcW w:type="dxa" w:w="4000"/>
+            <w:tcW w:type="dxa" w:w="4100"/>
             <w:tcBorders>
               <w:top w:val="single" w:color="C9D0E3" w:sz="2"/>
               <w:left w:val="single" w:color="C9D0E3" w:sz="2"/>
@@ -496,9 +447,9 @@
             <w:shd w:fill="FFFFFF" w:val="clear"/>
             <w:tcMar>
               <w:top w:type="dxa" w:w="70"/>
-              <w:left w:type="dxa" w:w="120"/>
+              <w:left w:type="dxa" w:w="130"/>
               <w:bottom w:type="dxa" w:w="70"/>
-              <w:right w:type="dxa" w:w="120"/>
+              <w:right w:type="dxa" w:w="130"/>
             </w:tcMar>
           </w:tcPr>
           <w:p>
@@ -516,7 +467,7 @@
       <w:tr>
         <w:tc>
           <w:tcPr>
-            <w:tcW w:type="dxa" w:w="2600"/>
+            <w:tcW w:type="dxa" w:w="2700"/>
             <w:tcBorders>
               <w:top w:val="single" w:color="C9D0E3" w:sz="2"/>
               <w:left w:val="single" w:color="C9D0E3" w:sz="2"/>
@@ -526,9 +477,9 @@
             <w:shd w:fill="EEF1F8" w:val="clear"/>
             <w:tcMar>
               <w:top w:type="dxa" w:w="70"/>
-              <w:left w:type="dxa" w:w="120"/>
+              <w:left w:type="dxa" w:w="130"/>
               <w:bottom w:type="dxa" w:w="70"/>
-              <w:right w:type="dxa" w:w="120"/>
+              <w:right w:type="dxa" w:w="130"/>
             </w:tcMar>
           </w:tcPr>
           <w:p>
@@ -546,7 +497,7 @@
         </w:tc>
         <w:tc>
           <w:tcPr>
-            <w:tcW w:type="dxa" w:w="4000"/>
+            <w:tcW w:type="dxa" w:w="4100"/>
             <w:tcBorders>
               <w:top w:val="single" w:color="C9D0E3" w:sz="2"/>
               <w:left w:val="single" w:color="C9D0E3" w:sz="2"/>
@@ -556,9 +507,9 @@
             <w:shd w:fill="FFFFFF" w:val="clear"/>
             <w:tcMar>
               <w:top w:type="dxa" w:w="70"/>
-              <w:left w:type="dxa" w:w="120"/>
+              <w:left w:type="dxa" w:w="130"/>
               <w:bottom w:type="dxa" w:w="70"/>
-              <w:right w:type="dxa" w:w="120"/>
+              <w:right w:type="dxa" w:w="130"/>
             </w:tcMar>
           </w:tcPr>
           <w:p>
@@ -568,7 +519,7 @@
                 <w:sz w:val="18"/>
                 <w:szCs w:val="18"/>
               </w:rPr>
-              <w:t xml:space="preserve">Innovación y Desarrollo — HUV</w:t>
+              <w:t xml:space="preserve">Oficina de Innovación y Desarrollo — HUV</w:t>
             </w:r>
           </w:p>
         </w:tc>
@@ -576,29 +527,28 @@
     </w:tbl>
     <w:p>
       <w:pPr>
-        <w:spacing w:after="1400"/>
+        <w:spacing w:after="640"/>
       </w:pPr>
     </w:p>
     <w:p>
       <w:pPr>
-        <w:pBdr>
-          <w:bottom w:val="single" w:color="2E3F84" w:sz="40" w:space="0"/>
-        </w:pBdr>
-        <w:shd w:fill="2E3F84" w:val="clear"/>
-        <w:spacing w:after="0" w:before="0"/>
+        <w:spacing w:after="40"/>
+        <w:jc w:val="center"/>
       </w:pPr>
       <w:r>
         <w:rPr>
-          <w:color w:val="1F2433"/>
-          <w:sz w:val="2"/>
-          <w:szCs w:val="2"/>
+          <w:b/>
+          <w:bCs/>
+          <w:color w:val="16235E"/>
+          <w:sz w:val="19"/>
+          <w:szCs w:val="19"/>
         </w:rPr>
-        <w:t xml:space="preserve"> </w:t>
+        <w:t xml:space="preserve">Hospital Universitario del Valle «Evaristo García» E.S.E.</w:t>
       </w:r>
     </w:p>
     <w:p>
       <w:pPr>
-        <w:spacing w:before="120"/>
+        <w:spacing w:after="0"/>
         <w:jc w:val="center"/>
       </w:pPr>
       <w:r>
@@ -627,8 +577,9 @@
     <w:p>
       <w:pPr>
         <w:sectPr>
+          <w:headerReference w:type="default" r:id="rId7"/>
           <w:pgSz w:w="12240" w:h="15840" w:orient="portrait"/>
-          <w:pgMar w:top="1440" w:right="1440" w:bottom="1440" w:left="1440" w:header="708" w:footer="708" w:gutter="0"/>
+          <w:pgMar w:top="2774" w:right="1134" w:bottom="1700" w:left="1701" w:header="283" w:footer="1417" w:gutter="0"/>
           <w:pgNumType/>
           <w:docGrid w:linePitch="360"/>
         </w:sectPr>
@@ -1389,7 +1340,7 @@
         <w:rPr>
           <w:color w:val="1F2433"/>
         </w:rPr>
-        <w:t xml:space="preserve">El archivo .env reside en la raíz del proyecto y define los parámetros de infraestructura. Tras cualquier cambio en este archivo debe limpiarse la caché de configuración con el comando correspondiente (ver sección 11).</w:t>
+        <w:t xml:space="preserve">El archivo .env reside en la raíz del proyecto y define los parámetros de infraestructura. Tras cualquier cambio en este archivo debe limpiarse la caché de configuración con el comando correspondiente (ver sección 9).</w:t>
       </w:r>
     </w:p>
     <w:p>
@@ -10660,11 +10611,11 @@
       </w:tr>
     </w:tbl>
     <w:sectPr>
-      <w:headerReference w:type="default" r:id="rId7"/>
-      <w:footerReference w:type="default" r:id="rId8"/>
+      <w:headerReference w:type="default" r:id="rId8"/>
+      <w:footerReference w:type="default" r:id="rId9"/>
       <w:pgSz w:w="12240" w:h="15840" w:orient="portrait"/>
-      <w:pgMar w:top="1440" w:right="1440" w:bottom="1440" w:left="1440" w:header="708" w:footer="708" w:gutter="0"/>
-      <w:pgNumType/>
+      <w:pgMar w:top="2774" w:right="1134" w:bottom="1700" w:left="1701" w:header="283" w:footer="1417" w:gutter="0"/>
+      <w:pgNumType w:start="1"/>
       <w:docGrid w:linePitch="360"/>
     </w:sectPr>
   </w:body>
@@ -10716,32 +10667,21 @@
 <w:ftr xmlns:wpc="http://schemas.microsoft.com/office/word/2010/wordprocessingCanvas" xmlns:mc="http://schemas.openxmlformats.org/markup-compatibility/2006" xmlns:o="urn:schemas-microsoft-com:office:office" xmlns:r="http://schemas.openxmlformats.org/officeDocument/2006/relationships" xmlns:m="http://schemas.openxmlformats.org/officeDocument/2006/math" xmlns:v="urn:schemas-microsoft-com:vml" xmlns:wp14="http://schemas.microsoft.com/office/word/2010/wordprocessingDrawing" xmlns:wp="http://schemas.openxmlformats.org/drawingml/2006/wordprocessingDrawing" xmlns:w10="urn:schemas-microsoft-com:office:word" xmlns:w="http://schemas.openxmlformats.org/wordprocessingml/2006/main" xmlns:w14="http://schemas.microsoft.com/office/word/2010/wordml" xmlns:w15="http://schemas.microsoft.com/office/word/2012/wordml" xmlns:wpg="http://schemas.microsoft.com/office/word/2010/wordprocessingGroup" xmlns:wpi="http://schemas.microsoft.com/office/word/2010/wordprocessingInk" xmlns:wne="http://schemas.microsoft.com/office/word/2006/wordml" xmlns:wps="http://schemas.microsoft.com/office/word/2010/wordprocessingShape">
   <w:p>
     <w:pPr>
-      <w:pBdr>
-        <w:top w:val="single" w:color="C9D0E3" w:sz="4" w:space="4"/>
-      </w:pBdr>
-      <w:tabs>
-        <w:tab w:val="right" w:pos="9360"/>
-      </w:tabs>
-      <w:spacing w:before="0"/>
+      <w:spacing w:after="0" w:before="0"/>
+      <w:jc w:val="center"/>
     </w:pPr>
     <w:r>
       <w:rPr>
+        <w:rFonts w:ascii="Arial" w:cs="Arial" w:eastAsia="Arial" w:hAnsi="Arial"/>
         <w:color w:val="5A6478"/>
         <w:sz w:val="15"/>
         <w:szCs w:val="15"/>
       </w:rPr>
-      <w:t xml:space="preserve">EVB-DOC-01 · Hospital Universitario del Valle</w:t>
+      <w:t xml:space="preserve">Página </w:t>
     </w:r>
     <w:r>
       <w:rPr>
-        <w:color w:val="5A6478"/>
-        <w:sz w:val="15"/>
-        <w:szCs w:val="15"/>
-      </w:rPr>
-      <w:t xml:space="preserve">	Página </w:t>
-    </w:r>
-    <w:r>
-      <w:rPr>
+        <w:rFonts w:ascii="Arial" w:cs="Arial" w:eastAsia="Arial" w:hAnsi="Arial"/>
         <w:color w:val="5A6478"/>
         <w:sz w:val="15"/>
         <w:szCs w:val="15"/>
@@ -10753,6 +10693,7 @@
     </w:r>
     <w:r>
       <w:rPr>
+        <w:rFonts w:ascii="Arial" w:cs="Arial" w:eastAsia="Arial" w:hAnsi="Arial"/>
         <w:color w:val="5A6478"/>
         <w:sz w:val="15"/>
         <w:szCs w:val="15"/>
@@ -10761,6 +10702,7 @@
     </w:r>
     <w:r>
       <w:rPr>
+        <w:rFonts w:ascii="Arial" w:cs="Arial" w:eastAsia="Arial" w:hAnsi="Arial"/>
         <w:color w:val="5A6478"/>
         <w:sz w:val="15"/>
         <w:szCs w:val="15"/>
@@ -10815,31 +10757,113 @@
 <w:hdr xmlns:wpc="http://schemas.microsoft.com/office/word/2010/wordprocessingCanvas" xmlns:mc="http://schemas.openxmlformats.org/markup-compatibility/2006" xmlns:o="urn:schemas-microsoft-com:office:office" xmlns:r="http://schemas.openxmlformats.org/officeDocument/2006/relationships" xmlns:m="http://schemas.openxmlformats.org/officeDocument/2006/math" xmlns:v="urn:schemas-microsoft-com:vml" xmlns:wp14="http://schemas.microsoft.com/office/word/2010/wordprocessingDrawing" xmlns:wp="http://schemas.openxmlformats.org/drawingml/2006/wordprocessingDrawing" xmlns:w10="urn:schemas-microsoft-com:office:word" xmlns:w="http://schemas.openxmlformats.org/wordprocessingml/2006/main" xmlns:w14="http://schemas.microsoft.com/office/word/2010/wordml" xmlns:w15="http://schemas.microsoft.com/office/word/2012/wordml" xmlns:wpg="http://schemas.microsoft.com/office/word/2010/wordprocessingGroup" xmlns:wpi="http://schemas.microsoft.com/office/word/2010/wordprocessingInk" xmlns:wne="http://schemas.microsoft.com/office/word/2006/wordml" xmlns:wps="http://schemas.microsoft.com/office/word/2010/wordprocessingShape" xmlns:cx="http://schemas.microsoft.com/office/drawing/2014/chartex" xmlns:cx1="http://schemas.microsoft.com/office/drawing/2015/9/8/chartex" xmlns:cx2="http://schemas.microsoft.com/office/drawing/2015/10/21/chartex" xmlns:cx3="http://schemas.microsoft.com/office/drawing/2016/5/9/chartex" xmlns:cx4="http://schemas.microsoft.com/office/drawing/2016/5/10/chartex" xmlns:cx5="http://schemas.microsoft.com/office/drawing/2016/5/11/chartex" xmlns:cx6="http://schemas.microsoft.com/office/drawing/2016/5/12/chartex" xmlns:cx7="http://schemas.microsoft.com/office/drawing/2016/5/13/chartex" xmlns:cx8="http://schemas.microsoft.com/office/drawing/2016/5/14/chartex" xmlns:w16cid="http://schemas.microsoft.com/office/word/2016/wordml/cid" xmlns:w16se="http://schemas.microsoft.com/office/word/2015/wordml/symex">
   <w:p>
     <w:pPr>
-      <w:pBdr>
-        <w:bottom w:val="single" w:color="C9D0E3" w:sz="4" w:space="4"/>
-      </w:pBdr>
-      <w:tabs>
-        <w:tab w:val="right" w:pos="9360"/>
-      </w:tabs>
-      <w:spacing w:after="0"/>
+      <w:spacing w:after="0" w:before="0" w:line="240"/>
     </w:pPr>
     <w:r>
-      <w:rPr>
-        <w:b/>
-        <w:bCs/>
-        <w:color w:val="2E3F84"/>
-        <w:sz w:val="16"/>
-        <w:szCs w:val="16"/>
-      </w:rPr>
-      <w:t xml:space="preserve">EVARISBOT</w:t>
+      <w:drawing>
+        <wp:anchor distT="0" distB="0" distL="0" distR="0" simplePos="0" allowOverlap="1" behindDoc="1" locked="0" layoutInCell="1" relativeHeight="10058400">
+          <wp:simplePos x="0" y="0"/>
+          <wp:positionH relativeFrom="page">
+            <wp:posOffset>0</wp:posOffset>
+          </wp:positionH>
+          <wp:positionV relativeFrom="page">
+            <wp:posOffset>0</wp:posOffset>
+          </wp:positionV>
+          <wp:extent cx="7772400" cy="10058400"/>
+          <wp:effectExtent t="0" r="0" b="0" l="0"/>
+          <wp:wrapNone/>
+          <wp:docPr id="1" name="Membrete" descr="Membrete institucional del Hospital Universitario del Valle" title="Membrete HUV"/>
+          <wp:cNvGraphicFramePr>
+            <a:graphicFrameLocks xmlns:a="http://schemas.openxmlformats.org/drawingml/2006/main" noChangeAspect="1"/>
+          </wp:cNvGraphicFramePr>
+          <a:graphic xmlns:a="http://schemas.openxmlformats.org/drawingml/2006/main">
+            <a:graphicData uri="http://schemas.openxmlformats.org/drawingml/2006/picture">
+              <pic:pic xmlns:pic="http://schemas.openxmlformats.org/drawingml/2006/picture">
+                <pic:nvPicPr>
+                  <pic:cNvPr id="0" name="" descr=""/>
+                  <pic:cNvPicPr>
+                    <a:picLocks noChangeAspect="1" noChangeArrowheads="1"/>
+                  </pic:cNvPicPr>
+                </pic:nvPicPr>
+                <pic:blipFill>
+                  <a:blip r:embed="rId0" cstate="none"/>
+                  <a:srcRect/>
+                  <a:stretch>
+                    <a:fillRect/>
+                  </a:stretch>
+                </pic:blipFill>
+                <pic:spPr bwMode="auto">
+                  <a:xfrm>
+                    <a:off x="0" y="0"/>
+                    <a:ext cx="7772400" cy="10058400"/>
+                  </a:xfrm>
+                  <a:prstGeom prst="rect">
+                    <a:avLst/>
+                  </a:prstGeom>
+                </pic:spPr>
+              </pic:pic>
+            </a:graphicData>
+          </a:graphic>
+        </wp:anchor>
+      </w:drawing>
     </w:r>
+  </w:p>
+</w:hdr>
+</file>
+
+<file path=word/header2.xml><?xml version="1.0" encoding="utf-8"?>
+<w:hdr xmlns:wpc="http://schemas.microsoft.com/office/word/2010/wordprocessingCanvas" xmlns:mc="http://schemas.openxmlformats.org/markup-compatibility/2006" xmlns:o="urn:schemas-microsoft-com:office:office" xmlns:r="http://schemas.openxmlformats.org/officeDocument/2006/relationships" xmlns:m="http://schemas.openxmlformats.org/officeDocument/2006/math" xmlns:v="urn:schemas-microsoft-com:vml" xmlns:wp14="http://schemas.microsoft.com/office/word/2010/wordprocessingDrawing" xmlns:wp="http://schemas.openxmlformats.org/drawingml/2006/wordprocessingDrawing" xmlns:w10="urn:schemas-microsoft-com:office:word" xmlns:w="http://schemas.openxmlformats.org/wordprocessingml/2006/main" xmlns:w14="http://schemas.microsoft.com/office/word/2010/wordml" xmlns:w15="http://schemas.microsoft.com/office/word/2012/wordml" xmlns:wpg="http://schemas.microsoft.com/office/word/2010/wordprocessingGroup" xmlns:wpi="http://schemas.microsoft.com/office/word/2010/wordprocessingInk" xmlns:wne="http://schemas.microsoft.com/office/word/2006/wordml" xmlns:wps="http://schemas.microsoft.com/office/word/2010/wordprocessingShape" xmlns:cx="http://schemas.microsoft.com/office/drawing/2014/chartex" xmlns:cx1="http://schemas.microsoft.com/office/drawing/2015/9/8/chartex" xmlns:cx2="http://schemas.microsoft.com/office/drawing/2015/10/21/chartex" xmlns:cx3="http://schemas.microsoft.com/office/drawing/2016/5/9/chartex" xmlns:cx4="http://schemas.microsoft.com/office/drawing/2016/5/10/chartex" xmlns:cx5="http://schemas.microsoft.com/office/drawing/2016/5/11/chartex" xmlns:cx6="http://schemas.microsoft.com/office/drawing/2016/5/12/chartex" xmlns:cx7="http://schemas.microsoft.com/office/drawing/2016/5/13/chartex" xmlns:cx8="http://schemas.microsoft.com/office/drawing/2016/5/14/chartex" xmlns:w16cid="http://schemas.microsoft.com/office/word/2016/wordml/cid" xmlns:w16se="http://schemas.microsoft.com/office/word/2015/wordml/symex">
+  <w:p>
+    <w:pPr>
+      <w:spacing w:after="0" w:before="0" w:line="240"/>
+    </w:pPr>
     <w:r>
-      <w:rPr>
-        <w:color w:val="5A6478"/>
-        <w:sz w:val="16"/>
-        <w:szCs w:val="16"/>
-      </w:rPr>
-      <w:t xml:space="preserve">	Credenciales y Configuración</w:t>
+      <w:drawing>
+        <wp:anchor distT="0" distB="0" distL="0" distR="0" simplePos="0" allowOverlap="1" behindDoc="1" locked="0" layoutInCell="1" relativeHeight="10058400">
+          <wp:simplePos x="0" y="0"/>
+          <wp:positionH relativeFrom="page">
+            <wp:posOffset>0</wp:posOffset>
+          </wp:positionH>
+          <wp:positionV relativeFrom="page">
+            <wp:posOffset>0</wp:posOffset>
+          </wp:positionV>
+          <wp:extent cx="7772400" cy="10058400"/>
+          <wp:effectExtent t="0" r="0" b="0" l="0"/>
+          <wp:wrapNone/>
+          <wp:docPr id="1" name="Membrete" descr="Membrete institucional del Hospital Universitario del Valle" title="Membrete HUV"/>
+          <wp:cNvGraphicFramePr>
+            <a:graphicFrameLocks xmlns:a="http://schemas.openxmlformats.org/drawingml/2006/main" noChangeAspect="1"/>
+          </wp:cNvGraphicFramePr>
+          <a:graphic xmlns:a="http://schemas.openxmlformats.org/drawingml/2006/main">
+            <a:graphicData uri="http://schemas.openxmlformats.org/drawingml/2006/picture">
+              <pic:pic xmlns:pic="http://schemas.openxmlformats.org/drawingml/2006/picture">
+                <pic:nvPicPr>
+                  <pic:cNvPr id="0" name="" descr=""/>
+                  <pic:cNvPicPr>
+                    <a:picLocks noChangeAspect="1" noChangeArrowheads="1"/>
+                  </pic:cNvPicPr>
+                </pic:nvPicPr>
+                <pic:blipFill>
+                  <a:blip r:embed="rId0" cstate="none"/>
+                  <a:srcRect/>
+                  <a:stretch>
+                    <a:fillRect/>
+                  </a:stretch>
+                </pic:blipFill>
+                <pic:spPr bwMode="auto">
+                  <a:xfrm>
+                    <a:off x="0" y="0"/>
+                    <a:ext cx="7772400" cy="10058400"/>
+                  </a:xfrm>
+                  <a:prstGeom prst="rect">
+                    <a:avLst/>
+                  </a:prstGeom>
+                </pic:spPr>
+              </pic:pic>
+            </a:graphicData>
+          </a:graphic>
+        </wp:anchor>
+      </w:drawing>
     </w:r>
   </w:p>
 </w:hdr>

</xml_diff>